<commit_message>
feat(ui): enable dashboard button with grid-based horizontal layout
Replaced flex with CSS grid for improved layout control.
Dashboard now scrolls horizontally instead of vertically.
Reused existing code to hook up the dashboard button.
</commit_message>
<xml_diff>
--- a/todo.docx
+++ b/todo.docx
@@ -238,6 +238,28 @@
           <w:sz w:val="28"/>
           <w:szCs w:val="28"/>
         </w:rPr>
+        <w:t>Get the assign function to work</w:t>
+      </w:r>
+    </w:p>
+    <w:p>
+      <w:pPr>
+        <w:pStyle w:val="ListParagraph"/>
+        <w:numPr>
+          <w:ilvl w:val="0"/>
+          <w:numId w:val="1"/>
+        </w:numPr>
+        <w:rPr>
+          <w:rFonts w:ascii="Times New Roman" w:hAnsi="Times New Roman" w:cs="Times New Roman"/>
+          <w:sz w:val="28"/>
+          <w:szCs w:val="28"/>
+        </w:rPr>
+      </w:pPr>
+      <w:r>
+        <w:rPr>
+          <w:rFonts w:ascii="Times New Roman" w:hAnsi="Times New Roman" w:cs="Times New Roman"/>
+          <w:sz w:val="28"/>
+          <w:szCs w:val="28"/>
+        </w:rPr>
         <w:t>Notifications pop up at the bottom-right</w:t>
       </w:r>
       <w:r>
@@ -583,6 +605,7 @@
           <w:sz w:val="28"/>
           <w:szCs w:val="28"/>
         </w:rPr>
+        <w:lastRenderedPageBreak/>
         <w:t>Add logic of residents leaving after a certain time</w:t>
       </w:r>
     </w:p>
@@ -605,7 +628,6 @@
           <w:sz w:val="28"/>
           <w:szCs w:val="28"/>
         </w:rPr>
-        <w:lastRenderedPageBreak/>
         <w:t>Add logic of new disaster victims requesting to be allocated shelters</w:t>
       </w:r>
     </w:p>

</xml_diff>